<commit_message>
se pasa a un contenedor lenguajes para el navegador para aislar y limitar su funcionamiento
</commit_message>
<xml_diff>
--- a/docs/Bitacora-instalacion-AWS.docx
+++ b/docs/Bitacora-instalacion-AWS.docx
@@ -2386,6 +2386,128 @@
         <w:pStyle w:val="Heading2"/>
       </w:pPr>
       <w:r>
+        <w:t>7. C2: lenguajes fuera del contenedor web, 26 de octubre</w:t>
+      </w:r>
+    </w:p>
+    <w:p>
+      <w:r>
+        <w:t xml:space="preserve">C, Java y los demás lenguajes del navegador corrían dentro del contenedor </w:t>
+      </w:r>
+      <w:r>
+        <w:rPr>
+          <w:rFonts w:ascii="Consolas" w:hAnsi="Consolas" w:eastAsia="Consolas"/>
+          <w:sz w:val="20"/>
+        </w:rPr>
+        <w:t>web</w:t>
+      </w:r>
+      <w:r>
+        <w:t>, el mismo que tiene la clave de Django, la de Gmail y la de Postgres. El pseudocódigo no: ese sigue en el runner. La aplicación de escritorio tampoco: ahí el lenguaje corre en la computadora del alumno.</w:t>
+      </w:r>
+    </w:p>
+    <w:p>
+      <w:r>
+        <w:t xml:space="preserve">El arreglo deja un servicio </w:t>
+      </w:r>
+      <w:r>
+        <w:rPr>
+          <w:rFonts w:ascii="Consolas" w:hAnsi="Consolas" w:eastAsia="Consolas"/>
+          <w:sz w:val="20"/>
+        </w:rPr>
+        <w:t>languages</w:t>
+      </w:r>
+      <w:r>
+        <w:t xml:space="preserve"> en </w:t>
+      </w:r>
+      <w:r>
+        <w:rPr>
+          <w:rFonts w:ascii="Consolas" w:hAnsi="Consolas" w:eastAsia="Consolas"/>
+          <w:sz w:val="20"/>
+        </w:rPr>
+        <w:t>compose.servidor.yaml</w:t>
+      </w:r>
+      <w:r>
+        <w:t>. Gunicorn ya no lo arranca (</w:t>
+      </w:r>
+      <w:r>
+        <w:rPr>
+          <w:rFonts w:ascii="Consolas" w:hAnsi="Consolas" w:eastAsia="Consolas"/>
+          <w:sz w:val="20"/>
+        </w:rPr>
+        <w:t>TRAZA_LANGUAGE_HOST=0</w:t>
+      </w:r>
+      <w:r>
+        <w:t>). Si ese servicio no responde, Django no ejecuta el programa por su cuenta. La calificación de un reto en otro lenguaje usa el mismo servicio.</w:t>
+      </w:r>
+    </w:p>
+    <w:p>
+      <w:r>
+        <w:t xml:space="preserve">El contenedor tiene usuario sin privilegios, disco de solo lectura, memoria, CPU y procesos limitados, y una red interna sin salida. No monta el repositorio ni el </w:t>
+      </w:r>
+      <w:r>
+        <w:rPr>
+          <w:rFonts w:ascii="Consolas" w:hAnsi="Consolas" w:eastAsia="Consolas"/>
+          <w:sz w:val="20"/>
+        </w:rPr>
+        <w:t>.env</w:t>
+      </w:r>
+      <w:r>
+        <w:t>. Node, Java y .NET quedan dentro de la imagen. C, C++ y Python usan gcc y el Python de la imagen. El puerto 8766 no se publica.</w:t>
+      </w:r>
+    </w:p>
+    <w:p>
+      <w:r>
+        <w:t xml:space="preserve">En la máquina local, </w:t>
+      </w:r>
+      <w:r>
+        <w:rPr>
+          <w:rFonts w:ascii="Consolas" w:hAnsi="Consolas" w:eastAsia="Consolas"/>
+          <w:sz w:val="20"/>
+        </w:rPr>
+        <w:t>compose.yaml</w:t>
+      </w:r>
+      <w:r>
+        <w:t xml:space="preserve"> sigue arrancando el host dentro de </w:t>
+      </w:r>
+      <w:r>
+        <w:rPr>
+          <w:rFonts w:ascii="Consolas" w:hAnsi="Consolas" w:eastAsia="Consolas"/>
+          <w:sz w:val="20"/>
+        </w:rPr>
+        <w:t>web</w:t>
+      </w:r>
+      <w:r>
+        <w:t xml:space="preserve">. El desarrollo no cambia. La aplicación de escritorio sigue hablando con </w:t>
+      </w:r>
+      <w:r>
+        <w:rPr>
+          <w:rFonts w:ascii="Consolas" w:hAnsi="Consolas" w:eastAsia="Consolas"/>
+          <w:sz w:val="20"/>
+        </w:rPr>
+        <w:t>local_host</w:t>
+      </w:r>
+      <w:r>
+        <w:t xml:space="preserve"> en la computadora del alumno y con la API solo para la cuenta y los proyectos.</w:t>
+      </w:r>
+    </w:p>
+    <w:p>
+      <w:r>
+        <w:t>Al repetir el arranque se agrega:</w:t>
+      </w:r>
+    </w:p>
+    <w:p>
+      <w:r>
+        <w:rPr>
+          <w:rFonts w:ascii="Consolas" w:hAnsi="Consolas" w:eastAsia="Consolas"/>
+          <w:sz w:val="18"/>
+        </w:rPr>
+        <w:t>docker compose -f compose.servidor.yaml build languages</w:t>
+      </w:r>
+    </w:p>
+    <w:p>
+      <w:pPr>
+        <w:pStyle w:val="Heading2"/>
+      </w:pPr>
+      <w:r>
         <w:t>Qué no se repite</w:t>
       </w:r>
     </w:p>

</xml_diff>